<commit_message>
feat: complete asphalt batch integration for vehicle 12345, customer data, and handover planning docs
</commit_message>
<xml_diff>
--- a/QUY_HOACH_DU_AN_BPAC_ENQ01.docx
+++ b/QUY_HOACH_DU_AN_BPAC_ENQ01.docx
@@ -194,6 +194,67 @@
     </w:p>
     <w:p>
       <w:pPr>
+        <w:spacing w:before="280" w:after="80"/>
+      </w:pPr>
+      <w:r>
+        <w:rPr>
+          <w:rFonts w:ascii="Arial" w:hAnsi="Arial"/>
+          <w:b/>
+          <w:color w:val="0D47A1"/>
+          <w:sz w:val="28"/>
+        </w:rPr>
+        <w:t>★ ĐẶC THÙ CÔNG NGHỆ: TRẠM BÊ TÔNG NHỰA NÓNG (ASPHALT) KHÔNG PHẢI BÊ TÔNG XI MĂNG</w:t>
+      </w:r>
+    </w:p>
+    <w:tbl>
+      <w:tblPr>
+        <w:tblW w:type="auto" w:w="0"/>
+        <w:jc w:val="center"/>
+        <w:tblLayout w:type="fixed"/>
+        <w:tblLook w:firstColumn="1" w:firstRow="1" w:lastColumn="0" w:lastRow="0" w:noHBand="0" w:noVBand="1" w:val="04A0"/>
+      </w:tblPr>
+      <w:tblGrid>
+        <w:gridCol w:w="9792"/>
+      </w:tblGrid>
+      <w:tr>
+        <w:tc>
+          <w:tcPr>
+            <w:tcW w:type="dxa" w:w="9936"/>
+            <w:shd w:fill="E3F2FD"/>
+            <w:tcMar>
+              <w:top w:w="120" w:type="dxa"/>
+              <w:bottom w:w="120" w:type="dxa"/>
+              <w:left w:w="180" w:type="dxa"/>
+              <w:right w:w="180" w:type="dxa"/>
+            </w:tcMar>
+          </w:tcPr>
+          <w:p>
+            <w:pPr>
+              <w:spacing w:after="40"/>
+            </w:pPr>
+            <w:r>
+              <w:rPr>
+                <w:rFonts w:ascii="Arial" w:hAnsi="Arial"/>
+                <w:b/>
+                <w:color w:val="0D47A1"/>
+                <w:sz w:val="20"/>
+              </w:rPr>
+              <w:t xml:space="preserve">📌 LƯU Ý CỐT LÕI CỦA DỰ ÁN: </w:t>
+            </w:r>
+            <w:r>
+              <w:rPr>
+                <w:rFonts w:ascii="Arial" w:hAnsi="Arial"/>
+                <w:sz w:val="20"/>
+              </w:rPr>
+              <w:t>Dự án này phục vụ độc quyền cho TRẠM TRỘN BÊ TÔNG NHỰA NÓNG ASPHALT (ENQ 01). Tuyệt đối không nhầm lẫn với trạm bê tông xi măng (bê tông tươi thương phẩm). Toàn bộ thuật ngữ, quy trình điều khiển và chỉ số kỹ thuật đều tuân theo tiêu chuẩn bê tông nhựa nóng TCVN 8819:2011.</w:t>
+            </w:r>
+          </w:p>
+        </w:tc>
+      </w:tr>
+    </w:tbl>
+    <w:p/>
+    <w:p>
+      <w:pPr>
         <w:spacing w:after="80" w:line="276" w:lineRule="auto"/>
       </w:pPr>
       <w:r>
@@ -203,7 +264,7 @@
           <w:color w:val="212529"/>
           <w:sz w:val="21"/>
         </w:rPr>
-        <w:t>M:\My Drive\Dev\ENQ\TramTron_Web\ENQ_WEB</w:t>
+        <w:t>Dùng Nhựa đường đặc Asphalt 60/70 (Bitumen) được gia nhiệt nóng chảy ở 150°C - 165°C. TUYỆT ĐỐI KHÔNG DÙNG XI MĂNG VÀ KHÔNG DÙNG NƯỚC.</w:t>
       </w:r>
       <w:r>
         <w:rPr>
@@ -212,7 +273,122 @@
           <w:color w:val="212529"/>
           <w:sz w:val="21"/>
         </w:rPr>
-        <w:t xml:space="preserve">• Bản sao lưu Google Drive: </w:t>
+        <w:t xml:space="preserve">1. Chất liên kết (Binder): </w:t>
+      </w:r>
+    </w:p>
+    <w:p>
+      <w:pPr>
+        <w:spacing w:after="80" w:line="276" w:lineRule="auto"/>
+      </w:pPr>
+      <w:r>
+        <w:rPr>
+          <w:rFonts w:ascii="Arial" w:hAnsi="Arial"/>
+          <w:b/>
+          <w:color w:val="212529"/>
+          <w:sz w:val="21"/>
+        </w:rPr>
+        <w:t>Gồm các cỡ đá dăm (Đá 10-20, Đá 5-10, Đá mạt 0-5) và cát xay được sấy khô, nung nóng trong tang sấy ở 160°C - 180°C trước khi đưa lên tháp trộn.</w:t>
+      </w:r>
+      <w:r>
+        <w:rPr>
+          <w:rFonts w:ascii="Arial" w:hAnsi="Arial"/>
+          <w:i w:val="0"/>
+          <w:color w:val="212529"/>
+          <w:sz w:val="21"/>
+        </w:rPr>
+        <w:t xml:space="preserve">2. Cốt liệu khoáng (Aggregates): </w:t>
+      </w:r>
+    </w:p>
+    <w:p>
+      <w:pPr>
+        <w:spacing w:after="80" w:line="276" w:lineRule="auto"/>
+      </w:pPr>
+      <w:r>
+        <w:rPr>
+          <w:rFonts w:ascii="Arial" w:hAnsi="Arial"/>
+          <w:b/>
+          <w:color w:val="212529"/>
+          <w:sz w:val="21"/>
+        </w:rPr>
+        <w:t>Bột đá vôi nghiền mịn lọt sàng 0.075mm (ký hiệu PG-F hoặc Filler) đóng vai trò chất độn tăng độ đặc chắc, tăng diện tích tiếp xúc với nhựa đường.</w:t>
+      </w:r>
+      <w:r>
+        <w:rPr>
+          <w:rFonts w:ascii="Arial" w:hAnsi="Arial"/>
+          <w:i w:val="0"/>
+          <w:color w:val="212529"/>
+          <w:sz w:val="21"/>
+        </w:rPr>
+        <w:t xml:space="preserve">3. Bột khoáng (Mineral Filler): </w:t>
+      </w:r>
+    </w:p>
+    <w:p>
+      <w:pPr>
+        <w:spacing w:after="80" w:line="276" w:lineRule="auto"/>
+      </w:pPr>
+      <w:r>
+        <w:rPr>
+          <w:rFonts w:ascii="Arial" w:hAnsi="Arial"/>
+          <w:b/>
+          <w:color w:val="212529"/>
+          <w:sz w:val="21"/>
+        </w:rPr>
+        <w:t>Phụ gia biến tính SBS hoặc phụ gia tăng bám dính nhằm nâng cao độ ổn định nhiệt và chống lún vệt bánh xe của mặt đường.</w:t>
+      </w:r>
+      <w:r>
+        <w:rPr>
+          <w:rFonts w:ascii="Arial" w:hAnsi="Arial"/>
+          <w:i w:val="0"/>
+          <w:color w:val="212529"/>
+          <w:sz w:val="21"/>
+        </w:rPr>
+        <w:t xml:space="preserve">4. Phụ gia Polyme (Additives): </w:t>
+      </w:r>
+    </w:p>
+    <w:p>
+      <w:pPr>
+        <w:spacing w:after="80" w:line="276" w:lineRule="auto"/>
+      </w:pPr>
+      <w:r>
+        <w:rPr>
+          <w:rFonts w:ascii="Arial" w:hAnsi="Arial"/>
+          <w:b/>
+          <w:color w:val="212529"/>
+          <w:sz w:val="21"/>
+        </w:rPr>
+        <w:t>Các cấp phối mác chuẩn gồm BTNC 9.5 (thảm mặt mịn), BTNC 12.5 (mặt đường phổ thông), BTNC 19 (lớp mặt dưới), BTNR 19/25 (bê tông nhựa rỗng làm móng) và bê tông nhựa Polyme.</w:t>
+      </w:r>
+      <w:r>
+        <w:rPr>
+          <w:rFonts w:ascii="Arial" w:hAnsi="Arial"/>
+          <w:i w:val="0"/>
+          <w:color w:val="212529"/>
+          <w:sz w:val="21"/>
+        </w:rPr>
+        <w:t xml:space="preserve">5. Mác bê tông nhựa: </w:t>
+      </w:r>
+    </w:p>
+    <w:p>
+      <w:pPr>
+        <w:spacing w:after="80" w:line="276" w:lineRule="auto"/>
+      </w:pPr>
+      <w:r>
+        <w:rPr>
+          <w:rFonts w:ascii="Arial" w:hAnsi="Arial"/>
+          <w:b/>
+          <w:color w:val="212529"/>
+          <w:sz w:val="21"/>
+        </w:rPr>
+        <w:t>Toàn bộ thành phần được cân điện tử theo khối lượng (Kg / Tấn). Thể tích thảm quy đổi m³ tính theo tỷ trọng đầm lèn thiết kế γ ≈ 2.400 kg/m³ (hoặc 2.4 Tấn/m³).</w:t>
+      </w:r>
+      <w:r>
+        <w:rPr>
+          <w:rFonts w:ascii="Arial" w:hAnsi="Arial"/>
+          <w:i w:val="0"/>
+          <w:color w:val="212529"/>
+          <w:sz w:val="21"/>
+        </w:rPr>
+        <w:t xml:space="preserve">6. Đơn vị tính &amp; Quy đổi: </w:t>
       </w:r>
     </w:p>
     <w:p>

</xml_diff>